<commit_message>
﻿Y5 v1.3.1 review: rebuild PDF/DOCX/HTML after reference 13 fix
Re-rendered v1.3.1 build artifacts after fixing reference 13 (Mishra et al.):
- y5_v1_3_1_master_synthesis.pdf: 1.65 MB (was 1.64 MB)
- y5_v1_3_1_master_synthesis.docx: 232 KB (was 232 KB)
- y5_v1_3_1_master_synthesis.html: 222 KB (was 222 KB)
- 92 pages (unchanged)

The reference 13 fix adds "Language Models. ICLR 2023." which was
previously orphaned at the end of the references section.

Co-Authored-By: Codex <noreply@archimedes.local>
</commit_message>
<xml_diff>
--- a/papers/y5_v1_3_1_master_synthesis.docx
+++ b/papers/y5_v1_3_1_master_synthesis.docx
@@ -20885,7 +20885,7 @@
         </w:numPr>
       </w:pPr>
       <w:r>
-        <w:t xml:space="preserve">P. Mishra et al. Self-Consistency Improves Chain of Thought Reasoning in</w:t>
+        <w:t xml:space="preserve">P. Mishra et al. Self-Consistency Improves Chain of Thought Reasoning in Large Language Models. ICLR 2023.</w:t>
       </w:r>
     </w:p>
     <w:p>
@@ -21106,17 +21106,6 @@
       </w:r>
       <w:r>
         <w:t xml:space="preserve">, 6(2):107-128, 1981. (Citation for §5.3.2 Hedges g bias correction.)</w:t>
-      </w:r>
-    </w:p>
-    <w:p>
-      <w:pPr>
-        <w:numPr>
-          <w:ilvl w:val="0"/>
-          <w:numId w:val="1000"/>
-        </w:numPr>
-      </w:pPr>
-      <w:r>
-        <w:t xml:space="preserve">Language Models. ICLR 2023.</w:t>
       </w:r>
     </w:p>
     <w:bookmarkEnd w:id="131"/>
@@ -32944,7 +32933,7 @@
         <w:rPr>
           <w:rFonts w:hint="eastAsia"/>
         </w:rPr>
-        <w:t xml:space="preserve">閳?{0.0,</w:t>
+        <w:t xml:space="preserve">闁�?{0.0,</w:t>
       </w:r>
       <w:r>
         <w:t xml:space="preserve"> 0.5, 1.0} due to rebalanced splits with 8 rollouts)</w:t>
@@ -33268,7 +33257,7 @@
         <w:rPr>
           <w:rFonts w:hint="eastAsia"/>
         </w:rPr>
-        <w:t xml:space="preserve">鍗?.4.</w:t>
+        <w:t xml:space="preserve">閸�?.4.</w:t>
       </w:r>
       <w:r>
         <w:t xml:space="preserve"> This means:</w:t>

</xml_diff>